<commit_message>
refactor: separate static guide hierarchy
</commit_message>
<xml_diff>
--- a/docs/static-guides/feishu-word/01-中转注册与API密钥/00-中转注册与API密钥配置教程.docx
+++ b/docs/static-guides/feishu-word/01-中转注册与API密钥/00-中转注册与API密钥配置教程.docx
@@ -14,7 +14,7 @@
       </w:pPr>
       <w:r>
         <w:rPr>
-          <w:rFonts w:ascii="Arial Unicode MS" w:hAnsi="Arial Unicode MS" w:eastAsia="Arial Unicode MS" w:cs="Arial Unicode MS"/>
+          <w:rFonts w:ascii="Arial" w:hAnsi="Arial" w:eastAsia="PingFang SC" w:cs="PingFang SC"/>
           <w:b/>
           <w:color w:val="2E74B5"/>
           <w:sz w:val="21"/>
@@ -30,7 +30,7 @@
       </w:pPr>
       <w:r>
         <w:rPr>
-          <w:rFonts w:ascii="Arial Unicode MS" w:hAnsi="Arial Unicode MS" w:eastAsia="Arial Unicode MS" w:cs="Arial Unicode MS"/>
+          <w:rFonts w:ascii="Arial" w:hAnsi="Arial" w:eastAsia="PingFang SC" w:cs="PingFang SC"/>
           <w:b/>
           <w:color w:val="0B2545"/>
           <w:sz w:val="54"/>
@@ -45,7 +45,7 @@
       </w:pPr>
       <w:r>
         <w:rPr>
-          <w:rFonts w:ascii="Arial Unicode MS" w:hAnsi="Arial Unicode MS" w:eastAsia="Arial Unicode MS" w:cs="Arial Unicode MS"/>
+          <w:rFonts w:ascii="Arial" w:hAnsi="Arial" w:eastAsia="PingFang SC" w:cs="PingFang SC"/>
           <w:color w:val="5F6368"/>
           <w:sz w:val="26"/>
         </w:rPr>
@@ -59,7 +59,7 @@
       </w:pPr>
       <w:r>
         <w:rPr>
-          <w:rFonts w:ascii="Arial Unicode MS" w:hAnsi="Arial Unicode MS" w:eastAsia="Arial Unicode MS" w:cs="Arial Unicode MS"/>
+          <w:rFonts w:ascii="Arial" w:hAnsi="Arial" w:eastAsia="PingFang SC" w:cs="PingFang SC"/>
           <w:b/>
           <w:color w:val="2E74B5"/>
           <w:sz w:val="20"/>
@@ -81,14 +81,14 @@
       </w:pPr>
       <w:r>
         <w:rPr>
-          <w:rFonts w:ascii="Arial Unicode MS" w:hAnsi="Arial Unicode MS" w:eastAsia="Arial Unicode MS" w:cs="Arial Unicode MS"/>
+          <w:rFonts w:ascii="Arial" w:hAnsi="Arial" w:eastAsia="PingFang SC" w:cs="PingFang SC"/>
           <w:b w:val="0"/>
         </w:rPr>
         <w:t>API base_url：</w:t>
       </w:r>
       <w:r>
         <w:rPr>
-          <w:rFonts w:ascii="Menlo" w:hAnsi="Menlo" w:eastAsia="Arial Unicode MS" w:cs="Arial Unicode MS"/>
+          <w:rFonts w:ascii="Menlo" w:hAnsi="Menlo" w:eastAsia="PingFang SC" w:cs="PingFang SC"/>
           <w:b w:val="0"/>
           <w:color w:val="1F4D78"/>
           <w:sz w:val="20"/>
@@ -102,7 +102,7 @@
       </w:pPr>
       <w:r>
         <w:rPr>
-          <w:rFonts w:ascii="Arial Unicode MS" w:hAnsi="Arial Unicode MS" w:eastAsia="Arial Unicode MS" w:cs="Arial Unicode MS"/>
+          <w:rFonts w:ascii="Arial" w:hAnsi="Arial" w:eastAsia="PingFang SC" w:cs="PingFang SC"/>
           <w:b w:val="0"/>
         </w:rPr>
         <w:t>本教程作为所有客户端配置教程的父文档，统一说明中转账户注册、权益兑换、API 密钥创建与分组选择。完成后，再阅读对应的子教程配置具体客户端。</w:t>
@@ -114,7 +114,7 @@
       </w:pPr>
       <w:r>
         <w:rPr>
-          <w:rFonts w:ascii="Arial Unicode MS" w:hAnsi="Arial Unicode MS" w:eastAsia="Arial Unicode MS" w:cs="Arial Unicode MS"/>
+          <w:rFonts w:ascii="Arial" w:hAnsi="Arial" w:eastAsia="PingFang SC" w:cs="PingFang SC"/>
           <w:b w:val="0"/>
         </w:rPr>
         <w:t>教程要点</w:t>
@@ -130,7 +130,7 @@
       </w:pPr>
       <w:r>
         <w:rPr>
-          <w:rFonts w:ascii="Arial Unicode MS" w:hAnsi="Arial Unicode MS" w:eastAsia="Arial Unicode MS" w:cs="Arial Unicode MS"/>
+          <w:rFonts w:ascii="Arial" w:hAnsi="Arial" w:eastAsia="PingFang SC" w:cs="PingFang SC"/>
           <w:b w:val="0"/>
         </w:rPr>
         <w:t>注册中转账户</w:t>
@@ -146,7 +146,7 @@
       </w:pPr>
       <w:r>
         <w:rPr>
-          <w:rFonts w:ascii="Arial Unicode MS" w:hAnsi="Arial Unicode MS" w:eastAsia="Arial Unicode MS" w:cs="Arial Unicode MS"/>
+          <w:rFonts w:ascii="Arial" w:hAnsi="Arial" w:eastAsia="PingFang SC" w:cs="PingFang SC"/>
           <w:b w:val="0"/>
         </w:rPr>
         <w:t>充值或兑换权益</w:t>
@@ -162,7 +162,7 @@
       </w:pPr>
       <w:r>
         <w:rPr>
-          <w:rFonts w:ascii="Arial Unicode MS" w:hAnsi="Arial Unicode MS" w:eastAsia="Arial Unicode MS" w:cs="Arial Unicode MS"/>
+          <w:rFonts w:ascii="Arial" w:hAnsi="Arial" w:eastAsia="PingFang SC" w:cs="PingFang SC"/>
           <w:b w:val="0"/>
         </w:rPr>
         <w:t>创建 API 密钥</w:t>
@@ -178,7 +178,7 @@
       </w:pPr>
       <w:r>
         <w:rPr>
-          <w:rFonts w:ascii="Arial Unicode MS" w:hAnsi="Arial Unicode MS" w:eastAsia="Arial Unicode MS" w:cs="Arial Unicode MS"/>
+          <w:rFonts w:ascii="Arial" w:hAnsi="Arial" w:eastAsia="PingFang SC" w:cs="PingFang SC"/>
           <w:b w:val="0"/>
         </w:rPr>
         <w:t>选择正确分组</w:t>
@@ -190,7 +190,7 @@
       </w:pPr>
       <w:r>
         <w:rPr>
-          <w:rFonts w:ascii="Arial Unicode MS" w:hAnsi="Arial Unicode MS" w:eastAsia="Arial Unicode MS" w:cs="Arial Unicode MS"/>
+          <w:rFonts w:ascii="Arial" w:hAnsi="Arial" w:eastAsia="PingFang SC" w:cs="PingFang SC"/>
           <w:b w:val="0"/>
         </w:rPr>
         <w:t>中转注册、兑换与 API 密钥配置流程</w:t>
@@ -202,7 +202,7 @@
       </w:pPr>
       <w:r>
         <w:rPr>
-          <w:rFonts w:ascii="Arial Unicode MS" w:hAnsi="Arial Unicode MS" w:eastAsia="Arial Unicode MS" w:cs="Arial Unicode MS"/>
+          <w:rFonts w:ascii="Arial" w:hAnsi="Arial" w:eastAsia="PingFang SC" w:cs="PingFang SC"/>
           <w:b w:val="0"/>
         </w:rPr>
         <w:t>一、教程目录关系</w:t>
@@ -214,7 +214,7 @@
       </w:pPr>
       <w:r>
         <w:rPr>
-          <w:rFonts w:ascii="Arial Unicode MS" w:hAnsi="Arial Unicode MS" w:eastAsia="Arial Unicode MS" w:cs="Arial Unicode MS"/>
+          <w:rFonts w:ascii="Arial" w:hAnsi="Arial" w:eastAsia="PingFang SC" w:cs="PingFang SC"/>
           <w:b w:val="0"/>
         </w:rPr>
         <w:t>本文档是父教程。以下配置文档均作为子教程，不再重复讲解注册、兑换和创建 API 密钥。</w:t>
@@ -256,7 +256,7 @@
             </w:pPr>
             <w:r>
               <w:rPr>
-                <w:rFonts w:ascii="Arial Unicode MS" w:hAnsi="Arial Unicode MS" w:eastAsia="Arial Unicode MS" w:cs="Arial Unicode MS"/>
+                <w:rFonts w:ascii="Arial" w:hAnsi="Arial" w:eastAsia="PingFang SC" w:cs="PingFang SC"/>
                 <w:b/>
               </w:rPr>
               <w:t>子教程</w:t>
@@ -275,7 +275,7 @@
             </w:pPr>
             <w:r>
               <w:rPr>
-                <w:rFonts w:ascii="Arial Unicode MS" w:hAnsi="Arial Unicode MS" w:eastAsia="Arial Unicode MS" w:cs="Arial Unicode MS"/>
+                <w:rFonts w:ascii="Arial" w:hAnsi="Arial" w:eastAsia="PingFang SC" w:cs="PingFang SC"/>
                 <w:b/>
               </w:rPr>
               <w:t>内容</w:t>
@@ -298,7 +298,7 @@
             </w:pPr>
             <w:r>
               <w:rPr>
-                <w:rFonts w:ascii="Arial Unicode MS" w:hAnsi="Arial Unicode MS" w:eastAsia="Arial Unicode MS" w:cs="Arial Unicode MS"/>
+                <w:rFonts w:ascii="Arial" w:hAnsi="Arial" w:eastAsia="PingFang SC" w:cs="PingFang SC"/>
                 <w:b w:val="0"/>
               </w:rPr>
               <w:t>Codex API 登录对接教程</w:t>
@@ -316,7 +316,7 @@
             </w:pPr>
             <w:r>
               <w:rPr>
-                <w:rFonts w:ascii="Menlo" w:hAnsi="Menlo" w:eastAsia="Arial Unicode MS" w:cs="Arial Unicode MS"/>
+                <w:rFonts w:ascii="Menlo" w:hAnsi="Menlo" w:eastAsia="PingFang SC" w:cs="PingFang SC"/>
                 <w:b w:val="0"/>
                 <w:color w:val="1F4D78"/>
                 <w:sz w:val="20"/>
@@ -325,14 +325,14 @@
             </w:r>
             <w:r>
               <w:rPr>
-                <w:rFonts w:ascii="Arial Unicode MS" w:hAnsi="Arial Unicode MS" w:eastAsia="Arial Unicode MS" w:cs="Arial Unicode MS"/>
+                <w:rFonts w:ascii="Arial" w:hAnsi="Arial" w:eastAsia="PingFang SC" w:cs="PingFang SC"/>
                 <w:b w:val="0"/>
               </w:rPr>
               <w:t xml:space="preserve"> / </w:t>
             </w:r>
             <w:r>
               <w:rPr>
-                <w:rFonts w:ascii="Menlo" w:hAnsi="Menlo" w:eastAsia="Arial Unicode MS" w:cs="Arial Unicode MS"/>
+                <w:rFonts w:ascii="Menlo" w:hAnsi="Menlo" w:eastAsia="PingFang SC" w:cs="PingFang SC"/>
                 <w:b w:val="0"/>
                 <w:color w:val="1F4D78"/>
                 <w:sz w:val="20"/>
@@ -341,7 +341,7 @@
             </w:r>
             <w:r>
               <w:rPr>
-                <w:rFonts w:ascii="Arial Unicode MS" w:hAnsi="Arial Unicode MS" w:eastAsia="Arial Unicode MS" w:cs="Arial Unicode MS"/>
+                <w:rFonts w:ascii="Arial" w:hAnsi="Arial" w:eastAsia="PingFang SC" w:cs="PingFang SC"/>
                 <w:b w:val="0"/>
               </w:rPr>
               <w:t xml:space="preserve"> / API 登录</w:t>
@@ -364,7 +364,7 @@
             </w:pPr>
             <w:r>
               <w:rPr>
-                <w:rFonts w:ascii="Arial Unicode MS" w:hAnsi="Arial Unicode MS" w:eastAsia="Arial Unicode MS" w:cs="Arial Unicode MS"/>
+                <w:rFonts w:ascii="Arial" w:hAnsi="Arial" w:eastAsia="PingFang SC" w:cs="PingFang SC"/>
                 <w:b w:val="0"/>
               </w:rPr>
               <w:t>Claude Code 配置教程</w:t>
@@ -382,7 +382,7 @@
             </w:pPr>
             <w:r>
               <w:rPr>
-                <w:rFonts w:ascii="Menlo" w:hAnsi="Menlo" w:eastAsia="Arial Unicode MS" w:cs="Arial Unicode MS"/>
+                <w:rFonts w:ascii="Menlo" w:hAnsi="Menlo" w:eastAsia="PingFang SC" w:cs="PingFang SC"/>
                 <w:b w:val="0"/>
                 <w:color w:val="1F4D78"/>
                 <w:sz w:val="20"/>
@@ -391,7 +391,7 @@
             </w:r>
             <w:r>
               <w:rPr>
-                <w:rFonts w:ascii="Arial Unicode MS" w:hAnsi="Arial Unicode MS" w:eastAsia="Arial Unicode MS" w:cs="Arial Unicode MS"/>
+                <w:rFonts w:ascii="Arial" w:hAnsi="Arial" w:eastAsia="PingFang SC" w:cs="PingFang SC"/>
                 <w:b w:val="0"/>
               </w:rPr>
               <w:t xml:space="preserve"> / 环境变量 / CLI 验证</w:t>
@@ -414,7 +414,7 @@
             </w:pPr>
             <w:r>
               <w:rPr>
-                <w:rFonts w:ascii="Arial Unicode MS" w:hAnsi="Arial Unicode MS" w:eastAsia="Arial Unicode MS" w:cs="Arial Unicode MS"/>
+                <w:rFonts w:ascii="Arial" w:hAnsi="Arial" w:eastAsia="PingFang SC" w:cs="PingFang SC"/>
                 <w:b w:val="0"/>
               </w:rPr>
               <w:t>Open Code 配置教程</w:t>
@@ -432,7 +432,7 @@
             </w:pPr>
             <w:r>
               <w:rPr>
-                <w:rFonts w:ascii="Menlo" w:hAnsi="Menlo" w:eastAsia="Arial Unicode MS" w:cs="Arial Unicode MS"/>
+                <w:rFonts w:ascii="Menlo" w:hAnsi="Menlo" w:eastAsia="PingFang SC" w:cs="PingFang SC"/>
                 <w:b w:val="0"/>
                 <w:color w:val="1F4D78"/>
                 <w:sz w:val="20"/>
@@ -441,14 +441,14 @@
             </w:r>
             <w:r>
               <w:rPr>
-                <w:rFonts w:ascii="Arial Unicode MS" w:hAnsi="Arial Unicode MS" w:eastAsia="Arial Unicode MS" w:cs="Arial Unicode MS"/>
+                <w:rFonts w:ascii="Arial" w:hAnsi="Arial" w:eastAsia="PingFang SC" w:cs="PingFang SC"/>
                 <w:b w:val="0"/>
               </w:rPr>
               <w:t xml:space="preserve"> / </w:t>
             </w:r>
             <w:r>
               <w:rPr>
-                <w:rFonts w:ascii="Menlo" w:hAnsi="Menlo" w:eastAsia="Arial Unicode MS" w:cs="Arial Unicode MS"/>
+                <w:rFonts w:ascii="Menlo" w:hAnsi="Menlo" w:eastAsia="PingFang SC" w:cs="PingFang SC"/>
                 <w:b w:val="0"/>
                 <w:color w:val="1F4D78"/>
                 <w:sz w:val="20"/>
@@ -473,7 +473,7 @@
             </w:pPr>
             <w:r>
               <w:rPr>
-                <w:rFonts w:ascii="Arial Unicode MS" w:hAnsi="Arial Unicode MS" w:eastAsia="Arial Unicode MS" w:cs="Arial Unicode MS"/>
+                <w:rFonts w:ascii="Arial" w:hAnsi="Arial" w:eastAsia="PingFang SC" w:cs="PingFang SC"/>
                 <w:b w:val="0"/>
               </w:rPr>
               <w:t>Open Claw 配置教程</w:t>
@@ -491,7 +491,7 @@
             </w:pPr>
             <w:r>
               <w:rPr>
-                <w:rFonts w:ascii="Arial Unicode MS" w:hAnsi="Arial Unicode MS" w:eastAsia="Arial Unicode MS" w:cs="Arial Unicode MS"/>
+                <w:rFonts w:ascii="Arial" w:hAnsi="Arial" w:eastAsia="PingFang SC" w:cs="PingFang SC"/>
                 <w:b w:val="0"/>
               </w:rPr>
               <w:t>腾讯云在线配置 / 本地配置</w:t>
@@ -514,7 +514,7 @@
             </w:pPr>
             <w:r>
               <w:rPr>
-                <w:rFonts w:ascii="Arial Unicode MS" w:hAnsi="Arial Unicode MS" w:eastAsia="Arial Unicode MS" w:cs="Arial Unicode MS"/>
+                <w:rFonts w:ascii="Arial" w:hAnsi="Arial" w:eastAsia="PingFang SC" w:cs="PingFang SC"/>
                 <w:b w:val="0"/>
               </w:rPr>
               <w:t>移动端 Chatbox 配置教程</w:t>
@@ -532,7 +532,7 @@
             </w:pPr>
             <w:r>
               <w:rPr>
-                <w:rFonts w:ascii="Arial Unicode MS" w:hAnsi="Arial Unicode MS" w:eastAsia="Arial Unicode MS" w:cs="Arial Unicode MS"/>
+                <w:rFonts w:ascii="Arial" w:hAnsi="Arial" w:eastAsia="PingFang SC" w:cs="PingFang SC"/>
                 <w:b w:val="0"/>
               </w:rPr>
               <w:t>Chatbox / 手机配置 / 模型切换</w:t>
@@ -555,7 +555,7 @@
             </w:pPr>
             <w:r>
               <w:rPr>
-                <w:rFonts w:ascii="Arial Unicode MS" w:hAnsi="Arial Unicode MS" w:eastAsia="Arial Unicode MS" w:cs="Arial Unicode MS"/>
+                <w:rFonts w:ascii="Arial" w:hAnsi="Arial" w:eastAsia="PingFang SC" w:cs="PingFang SC"/>
                 <w:b w:val="0"/>
               </w:rPr>
               <w:t>Cherry Studio 图像生成教程</w:t>
@@ -573,7 +573,7 @@
             </w:pPr>
             <w:r>
               <w:rPr>
-                <w:rFonts w:ascii="Menlo" w:hAnsi="Menlo" w:eastAsia="Arial Unicode MS" w:cs="Arial Unicode MS"/>
+                <w:rFonts w:ascii="Menlo" w:hAnsi="Menlo" w:eastAsia="PingFang SC" w:cs="PingFang SC"/>
                 <w:b w:val="0"/>
                 <w:color w:val="1F4D78"/>
                 <w:sz w:val="20"/>
@@ -582,14 +582,14 @@
             </w:r>
             <w:r>
               <w:rPr>
-                <w:rFonts w:ascii="Arial Unicode MS" w:hAnsi="Arial Unicode MS" w:eastAsia="Arial Unicode MS" w:cs="Arial Unicode MS"/>
+                <w:rFonts w:ascii="Arial" w:hAnsi="Arial" w:eastAsia="PingFang SC" w:cs="PingFang SC"/>
                 <w:b w:val="0"/>
               </w:rPr>
               <w:t xml:space="preserve"> / </w:t>
             </w:r>
             <w:r>
               <w:rPr>
-                <w:rFonts w:ascii="Menlo" w:hAnsi="Menlo" w:eastAsia="Arial Unicode MS" w:cs="Arial Unicode MS"/>
+                <w:rFonts w:ascii="Menlo" w:hAnsi="Menlo" w:eastAsia="PingFang SC" w:cs="PingFang SC"/>
                 <w:b w:val="0"/>
                 <w:color w:val="1F4D78"/>
                 <w:sz w:val="20"/>
@@ -611,7 +611,7 @@
       </w:pPr>
       <w:r>
         <w:rPr>
-          <w:rFonts w:ascii="Arial Unicode MS" w:hAnsi="Arial Unicode MS" w:eastAsia="Arial Unicode MS" w:cs="Arial Unicode MS"/>
+          <w:rFonts w:ascii="Arial" w:hAnsi="Arial" w:eastAsia="PingFang SC" w:cs="PingFang SC"/>
           <w:b w:val="0"/>
         </w:rPr>
         <w:t>二、使用前说明</w:t>
@@ -623,7 +623,7 @@
       </w:pPr>
       <w:r>
         <w:rPr>
-          <w:rFonts w:ascii="Arial Unicode MS" w:hAnsi="Arial Unicode MS" w:eastAsia="Arial Unicode MS" w:cs="Arial Unicode MS"/>
+          <w:rFonts w:ascii="Arial" w:hAnsi="Arial" w:eastAsia="PingFang SC" w:cs="PingFang SC"/>
           <w:b w:val="0"/>
         </w:rPr>
         <w:t>本教程同时适用于质保补发的中转兑换码、站内充值或订阅，以及在链动小铺购买的额度包或订阅包。</w:t>
@@ -635,7 +635,7 @@
       </w:pPr>
       <w:r>
         <w:rPr>
-          <w:rFonts w:ascii="Arial Unicode MS" w:hAnsi="Arial Unicode MS" w:eastAsia="Arial Unicode MS" w:cs="Arial Unicode MS"/>
+          <w:rFonts w:ascii="Arial" w:hAnsi="Arial" w:eastAsia="PingFang SC" w:cs="PingFang SC"/>
           <w:b w:val="0"/>
         </w:rPr>
         <w:t>API 密钥分组选择规则：</w:t>
@@ -651,14 +651,14 @@
       </w:pPr>
       <w:r>
         <w:rPr>
-          <w:rFonts w:ascii="Arial Unicode MS" w:hAnsi="Arial Unicode MS" w:eastAsia="Arial Unicode MS" w:cs="Arial Unicode MS"/>
+          <w:rFonts w:ascii="Arial" w:hAnsi="Arial" w:eastAsia="PingFang SC" w:cs="PingFang SC"/>
           <w:b/>
         </w:rPr>
         <w:t>链动小铺额度包：选择 `GPT` 分组</w:t>
       </w:r>
       <w:r>
         <w:rPr>
-          <w:rFonts w:ascii="Arial Unicode MS" w:hAnsi="Arial Unicode MS" w:eastAsia="Arial Unicode MS" w:cs="Arial Unicode MS"/>
+          <w:rFonts w:ascii="Arial" w:hAnsi="Arial" w:eastAsia="PingFang SC" w:cs="PingFang SC"/>
           <w:b w:val="0"/>
         </w:rPr>
         <w:t xml:space="preserve"> 额度包使用时从网站账户余额中扣费。</w:t>
@@ -674,14 +674,14 @@
       </w:pPr>
       <w:r>
         <w:rPr>
-          <w:rFonts w:ascii="Arial Unicode MS" w:hAnsi="Arial Unicode MS" w:eastAsia="Arial Unicode MS" w:cs="Arial Unicode MS"/>
+          <w:rFonts w:ascii="Arial" w:hAnsi="Arial" w:eastAsia="PingFang SC" w:cs="PingFang SC"/>
           <w:b/>
         </w:rPr>
         <w:t>链动小铺订阅包：选择对应订阅分组</w:t>
       </w:r>
       <w:r>
         <w:rPr>
-          <w:rFonts w:ascii="Arial Unicode MS" w:hAnsi="Arial Unicode MS" w:eastAsia="Arial Unicode MS" w:cs="Arial Unicode MS"/>
+          <w:rFonts w:ascii="Arial" w:hAnsi="Arial" w:eastAsia="PingFang SC" w:cs="PingFang SC"/>
           <w:b w:val="0"/>
         </w:rPr>
         <w:t xml:space="preserve"> 选择与已购买套餐对应的订阅分组。</w:t>
@@ -697,14 +697,14 @@
       </w:pPr>
       <w:r>
         <w:rPr>
-          <w:rFonts w:ascii="Arial Unicode MS" w:hAnsi="Arial Unicode MS" w:eastAsia="Arial Unicode MS" w:cs="Arial Unicode MS"/>
+          <w:rFonts w:ascii="Arial" w:hAnsi="Arial" w:eastAsia="PingFang SC" w:cs="PingFang SC"/>
           <w:b/>
         </w:rPr>
         <w:t>质保补发码：选择“质保补偿”</w:t>
       </w:r>
       <w:r>
         <w:rPr>
-          <w:rFonts w:ascii="Arial Unicode MS" w:hAnsi="Arial Unicode MS" w:eastAsia="Arial Unicode MS" w:cs="Arial Unicode MS"/>
+          <w:rFonts w:ascii="Arial" w:hAnsi="Arial" w:eastAsia="PingFang SC" w:cs="PingFang SC"/>
           <w:b w:val="0"/>
         </w:rPr>
         <w:t xml:space="preserve"> 质保网站补发的中转兑换码使用订阅权益，不扣除额度余额。</w:t>
@@ -716,7 +716,7 @@
       </w:pPr>
       <w:r>
         <w:rPr>
-          <w:rFonts w:ascii="Arial Unicode MS" w:hAnsi="Arial Unicode MS" w:eastAsia="Arial Unicode MS" w:cs="Arial Unicode MS"/>
+          <w:rFonts w:ascii="Arial" w:hAnsi="Arial" w:eastAsia="PingFang SC" w:cs="PingFang SC"/>
           <w:b w:val="0"/>
         </w:rPr>
         <w:t>计费模式提醒：</w:t>
@@ -732,14 +732,14 @@
       </w:pPr>
       <w:r>
         <w:rPr>
-          <w:rFonts w:ascii="Arial Unicode MS" w:hAnsi="Arial Unicode MS" w:eastAsia="Arial Unicode MS" w:cs="Arial Unicode MS"/>
+          <w:rFonts w:ascii="Arial" w:hAnsi="Arial" w:eastAsia="PingFang SC" w:cs="PingFang SC"/>
           <w:b/>
         </w:rPr>
         <w:t>订阅模式：</w:t>
       </w:r>
       <w:r>
         <w:rPr>
-          <w:rFonts w:ascii="Arial Unicode MS" w:hAnsi="Arial Unicode MS" w:eastAsia="Arial Unicode MS" w:cs="Arial Unicode MS"/>
+          <w:rFonts w:ascii="Arial" w:hAnsi="Arial" w:eastAsia="PingFang SC" w:cs="PingFang SC"/>
           <w:b w:val="0"/>
         </w:rPr>
         <w:t>每天有固定额度，通常在每天 0 点后刷新。</w:t>
@@ -755,14 +755,14 @@
       </w:pPr>
       <w:r>
         <w:rPr>
-          <w:rFonts w:ascii="Arial Unicode MS" w:hAnsi="Arial Unicode MS" w:eastAsia="Arial Unicode MS" w:cs="Arial Unicode MS"/>
+          <w:rFonts w:ascii="Arial" w:hAnsi="Arial" w:eastAsia="PingFang SC" w:cs="PingFang SC"/>
           <w:b/>
         </w:rPr>
         <w:t>额度模式：</w:t>
       </w:r>
       <w:r>
         <w:rPr>
-          <w:rFonts w:ascii="Arial Unicode MS" w:hAnsi="Arial Unicode MS" w:eastAsia="Arial Unicode MS" w:cs="Arial Unicode MS"/>
+          <w:rFonts w:ascii="Arial" w:hAnsi="Arial" w:eastAsia="PingFang SC" w:cs="PingFang SC"/>
           <w:b w:val="0"/>
         </w:rPr>
         <w:t>调用时按实际消耗从网站账户余额中扣费。</w:t>
@@ -774,7 +774,7 @@
       </w:pPr>
       <w:r>
         <w:rPr>
-          <w:rFonts w:ascii="Arial Unicode MS" w:hAnsi="Arial Unicode MS" w:eastAsia="Arial Unicode MS" w:cs="Arial Unicode MS"/>
+          <w:rFonts w:ascii="Arial" w:hAnsi="Arial" w:eastAsia="PingFang SC" w:cs="PingFang SC"/>
           <w:b w:val="0"/>
         </w:rPr>
         <w:t>需要额外购买额度包时，可使用链动小铺卡密自助购买地址：</w:t>
@@ -782,7 +782,7 @@
       <w:hyperlink r:id="rId11">
         <w:r>
           <w:rPr>
-            <w:rFonts w:ascii="Arial Unicode MS" w:hAnsi="Arial Unicode MS" w:eastAsia="Arial Unicode MS" w:cs="Arial Unicode MS"/>
+            <w:rFonts w:ascii="Arial" w:hAnsi="Arial" w:eastAsia="PingFang SC" w:cs="PingFang SC"/>
             <w:color w:val="0563C1"/>
             <w:u w:val="single"/>
           </w:rPr>
@@ -837,7 +837,7 @@
       </w:pPr>
       <w:r>
         <w:rPr>
-          <w:rFonts w:ascii="Arial Unicode MS" w:hAnsi="Arial Unicode MS" w:eastAsia="Arial Unicode MS" w:cs="Arial Unicode MS"/>
+          <w:rFonts w:ascii="Arial" w:hAnsi="Arial" w:eastAsia="PingFang SC" w:cs="PingFang SC"/>
           <w:b w:val="0"/>
         </w:rPr>
         <w:t>图：有任何问题可扫码加群，联系群主处理。</w:t>
@@ -849,7 +849,7 @@
       </w:pPr>
       <w:r>
         <w:rPr>
-          <w:rFonts w:ascii="Arial Unicode MS" w:hAnsi="Arial Unicode MS" w:eastAsia="Arial Unicode MS" w:cs="Arial Unicode MS"/>
+          <w:rFonts w:ascii="Arial" w:hAnsi="Arial" w:eastAsia="PingFang SC" w:cs="PingFang SC"/>
           <w:b w:val="0"/>
         </w:rPr>
         <w:t>三、注册中转账户</w:t>
@@ -865,7 +865,7 @@
       </w:pPr>
       <w:r>
         <w:rPr>
-          <w:rFonts w:ascii="Arial Unicode MS" w:hAnsi="Arial Unicode MS" w:eastAsia="Arial Unicode MS" w:cs="Arial Unicode MS"/>
+          <w:rFonts w:ascii="Arial" w:hAnsi="Arial" w:eastAsia="PingFang SC" w:cs="PingFang SC"/>
           <w:b w:val="0"/>
         </w:rPr>
         <w:t>浏览器打开中转注册页：</w:t>
@@ -873,7 +873,7 @@
       <w:hyperlink r:id="rId13">
         <w:r>
           <w:rPr>
-            <w:rFonts w:ascii="Arial Unicode MS" w:hAnsi="Arial Unicode MS" w:eastAsia="Arial Unicode MS" w:cs="Arial Unicode MS"/>
+            <w:rFonts w:ascii="Arial" w:hAnsi="Arial" w:eastAsia="PingFang SC" w:cs="PingFang SC"/>
             <w:color w:val="0563C1"/>
             <w:u w:val="single"/>
           </w:rPr>
@@ -891,7 +891,7 @@
       </w:pPr>
       <w:r>
         <w:rPr>
-          <w:rFonts w:ascii="Arial Unicode MS" w:hAnsi="Arial Unicode MS" w:eastAsia="Arial Unicode MS" w:cs="Arial Unicode MS"/>
+          <w:rFonts w:ascii="Arial" w:hAnsi="Arial" w:eastAsia="PingFang SC" w:cs="PingFang SC"/>
           <w:b w:val="0"/>
         </w:rPr>
         <w:t>填写邮箱、获取验证码并设置密码。</w:t>
@@ -907,7 +907,7 @@
       </w:pPr>
       <w:r>
         <w:rPr>
-          <w:rFonts w:ascii="Arial Unicode MS" w:hAnsi="Arial Unicode MS" w:eastAsia="Arial Unicode MS" w:cs="Arial Unicode MS"/>
+          <w:rFonts w:ascii="Arial" w:hAnsi="Arial" w:eastAsia="PingFang SC" w:cs="PingFang SC"/>
           <w:b w:val="0"/>
         </w:rPr>
         <w:t>输入验证码后完成账户创建。</w:t>
@@ -960,7 +960,7 @@
       </w:pPr>
       <w:r>
         <w:rPr>
-          <w:rFonts w:ascii="Arial Unicode MS" w:hAnsi="Arial Unicode MS" w:eastAsia="Arial Unicode MS" w:cs="Arial Unicode MS"/>
+          <w:rFonts w:ascii="Arial" w:hAnsi="Arial" w:eastAsia="PingFang SC" w:cs="PingFang SC"/>
           <w:b w:val="0"/>
         </w:rPr>
         <w:t>图 1：注册页面，输入邮箱、密码和验证码后创建账户。</w:t>
@@ -972,7 +972,7 @@
       </w:pPr>
       <w:r>
         <w:rPr>
-          <w:rFonts w:ascii="Arial Unicode MS" w:hAnsi="Arial Unicode MS" w:eastAsia="Arial Unicode MS" w:cs="Arial Unicode MS"/>
+          <w:rFonts w:ascii="Arial" w:hAnsi="Arial" w:eastAsia="PingFang SC" w:cs="PingFang SC"/>
           <w:b w:val="0"/>
         </w:rPr>
         <w:t>四、获取并兑换权益</w:t>
@@ -984,7 +984,7 @@
       </w:pPr>
       <w:r>
         <w:rPr>
-          <w:rFonts w:ascii="Arial Unicode MS" w:hAnsi="Arial Unicode MS" w:eastAsia="Arial Unicode MS" w:cs="Arial Unicode MS"/>
+          <w:rFonts w:ascii="Arial" w:hAnsi="Arial" w:eastAsia="PingFang SC" w:cs="PingFang SC"/>
           <w:b w:val="0"/>
         </w:rPr>
         <w:t>账户内还没有可用权益时，可通过站内充值或订阅、卡密自助购买，或兑换已发放的中转兑换码获得权益。</w:t>
@@ -1000,7 +1000,7 @@
       </w:pPr>
       <w:r>
         <w:rPr>
-          <w:rFonts w:ascii="Arial Unicode MS" w:hAnsi="Arial Unicode MS" w:eastAsia="Arial Unicode MS" w:cs="Arial Unicode MS"/>
+          <w:rFonts w:ascii="Arial" w:hAnsi="Arial" w:eastAsia="PingFang SC" w:cs="PingFang SC"/>
           <w:b w:val="0"/>
         </w:rPr>
         <w:t>登录后打开兑换页：</w:t>
@@ -1008,7 +1008,7 @@
       <w:hyperlink r:id="rId15">
         <w:r>
           <w:rPr>
-            <w:rFonts w:ascii="Arial Unicode MS" w:hAnsi="Arial Unicode MS" w:eastAsia="Arial Unicode MS" w:cs="Arial Unicode MS"/>
+            <w:rFonts w:ascii="Arial" w:hAnsi="Arial" w:eastAsia="PingFang SC" w:cs="PingFang SC"/>
             <w:color w:val="0563C1"/>
             <w:u w:val="single"/>
           </w:rPr>
@@ -1026,7 +1026,7 @@
       </w:pPr>
       <w:r>
         <w:rPr>
-          <w:rFonts w:ascii="Arial Unicode MS" w:hAnsi="Arial Unicode MS" w:eastAsia="Arial Unicode MS" w:cs="Arial Unicode MS"/>
+          <w:rFonts w:ascii="Arial" w:hAnsi="Arial" w:eastAsia="PingFang SC" w:cs="PingFang SC"/>
           <w:b w:val="0"/>
         </w:rPr>
         <w:t>输入中转兑换码或额度包兑换码。</w:t>
@@ -1042,7 +1042,7 @@
       </w:pPr>
       <w:r>
         <w:rPr>
-          <w:rFonts w:ascii="Arial Unicode MS" w:hAnsi="Arial Unicode MS" w:eastAsia="Arial Unicode MS" w:cs="Arial Unicode MS"/>
+          <w:rFonts w:ascii="Arial" w:hAnsi="Arial" w:eastAsia="PingFang SC" w:cs="PingFang SC"/>
           <w:b w:val="0"/>
         </w:rPr>
         <w:t>点击“兑换”，并等待成功提示。</w:t>
@@ -1058,7 +1058,7 @@
       </w:pPr>
       <w:r>
         <w:rPr>
-          <w:rFonts w:ascii="Arial Unicode MS" w:hAnsi="Arial Unicode MS" w:eastAsia="Arial Unicode MS" w:cs="Arial Unicode MS"/>
+          <w:rFonts w:ascii="Arial" w:hAnsi="Arial" w:eastAsia="PingFang SC" w:cs="PingFang SC"/>
           <w:b w:val="0"/>
         </w:rPr>
         <w:t xml:space="preserve">打开个人资料页 </w:t>
@@ -1066,7 +1066,7 @@
       <w:hyperlink r:id="rId16">
         <w:r>
           <w:rPr>
-            <w:rFonts w:ascii="Arial Unicode MS" w:hAnsi="Arial Unicode MS" w:eastAsia="Arial Unicode MS" w:cs="Arial Unicode MS"/>
+            <w:rFonts w:ascii="Arial" w:hAnsi="Arial" w:eastAsia="PingFang SC" w:cs="PingFang SC"/>
             <w:color w:val="0563C1"/>
             <w:u w:val="single"/>
           </w:rPr>
@@ -1075,7 +1075,7 @@
       </w:hyperlink>
       <w:r>
         <w:rPr>
-          <w:rFonts w:ascii="Arial Unicode MS" w:hAnsi="Arial Unicode MS" w:eastAsia="Arial Unicode MS" w:cs="Arial Unicode MS"/>
+          <w:rFonts w:ascii="Arial" w:hAnsi="Arial" w:eastAsia="PingFang SC" w:cs="PingFang SC"/>
           <w:b w:val="0"/>
         </w:rPr>
         <w:t>，确认余额或订阅权益已经到账。</w:t>
@@ -1128,7 +1128,7 @@
       </w:pPr>
       <w:r>
         <w:rPr>
-          <w:rFonts w:ascii="Arial Unicode MS" w:hAnsi="Arial Unicode MS" w:eastAsia="Arial Unicode MS" w:cs="Arial Unicode MS"/>
+          <w:rFonts w:ascii="Arial" w:hAnsi="Arial" w:eastAsia="PingFang SC" w:cs="PingFang SC"/>
           <w:b w:val="0"/>
         </w:rPr>
         <w:t>图 2：兑换成功后，账户会获得对应余额或权益。</w:t>
@@ -1181,7 +1181,7 @@
       </w:pPr>
       <w:r>
         <w:rPr>
-          <w:rFonts w:ascii="Arial Unicode MS" w:hAnsi="Arial Unicode MS" w:eastAsia="Arial Unicode MS" w:cs="Arial Unicode MS"/>
+          <w:rFonts w:ascii="Arial" w:hAnsi="Arial" w:eastAsia="PingFang SC" w:cs="PingFang SC"/>
           <w:b w:val="0"/>
         </w:rPr>
         <w:t>图 3：兑换记录会出现在最近活动中，可用于确认权益是否到账。</w:t>
@@ -1193,7 +1193,7 @@
       </w:pPr>
       <w:r>
         <w:rPr>
-          <w:rFonts w:ascii="Arial Unicode MS" w:hAnsi="Arial Unicode MS" w:eastAsia="Arial Unicode MS" w:cs="Arial Unicode MS"/>
+          <w:rFonts w:ascii="Arial" w:hAnsi="Arial" w:eastAsia="PingFang SC" w:cs="PingFang SC"/>
           <w:b w:val="0"/>
         </w:rPr>
         <w:t>五、创建 API 密钥</w:t>
@@ -1208,7 +1208,7 @@
       </w:pPr>
       <w:r>
         <w:rPr>
-          <w:rFonts w:ascii="Arial Unicode MS" w:hAnsi="Arial Unicode MS" w:eastAsia="Arial Unicode MS" w:cs="Arial Unicode MS"/>
+          <w:rFonts w:ascii="Arial" w:hAnsi="Arial" w:eastAsia="PingFang SC" w:cs="PingFang SC"/>
           <w:b/>
         </w:rPr>
         <w:t>重要：本步是所有子教程的共同前置步骤。</w:t>
@@ -1224,7 +1224,7 @@
       </w:pPr>
       <w:r>
         <w:rPr>
-          <w:rFonts w:ascii="Arial Unicode MS" w:hAnsi="Arial Unicode MS" w:eastAsia="Arial Unicode MS" w:cs="Arial Unicode MS"/>
+          <w:rFonts w:ascii="Arial" w:hAnsi="Arial" w:eastAsia="PingFang SC" w:cs="PingFang SC"/>
           <w:b w:val="0"/>
         </w:rPr>
         <w:t xml:space="preserve">登录后打开 </w:t>
@@ -1232,7 +1232,7 @@
       <w:hyperlink r:id="rId19">
         <w:r>
           <w:rPr>
-            <w:rFonts w:ascii="Arial Unicode MS" w:hAnsi="Arial Unicode MS" w:eastAsia="Arial Unicode MS" w:cs="Arial Unicode MS"/>
+            <w:rFonts w:ascii="Arial" w:hAnsi="Arial" w:eastAsia="PingFang SC" w:cs="PingFang SC"/>
             <w:color w:val="0563C1"/>
             <w:u w:val="single"/>
           </w:rPr>
@@ -1241,7 +1241,7 @@
       </w:hyperlink>
       <w:r>
         <w:rPr>
-          <w:rFonts w:ascii="Arial Unicode MS" w:hAnsi="Arial Unicode MS" w:eastAsia="Arial Unicode MS" w:cs="Arial Unicode MS"/>
+          <w:rFonts w:ascii="Arial" w:hAnsi="Arial" w:eastAsia="PingFang SC" w:cs="PingFang SC"/>
           <w:b w:val="0"/>
         </w:rPr>
         <w:t>。</w:t>
@@ -1257,14 +1257,14 @@
       </w:pPr>
       <w:r>
         <w:rPr>
-          <w:rFonts w:ascii="Arial Unicode MS" w:hAnsi="Arial Unicode MS" w:eastAsia="Arial Unicode MS" w:cs="Arial Unicode MS"/>
+          <w:rFonts w:ascii="Arial" w:hAnsi="Arial" w:eastAsia="PingFang SC" w:cs="PingFang SC"/>
           <w:b w:val="0"/>
         </w:rPr>
         <w:t xml:space="preserve">点击“创建密钥”，按用途填写名称，例如 </w:t>
       </w:r>
       <w:r>
         <w:rPr>
-          <w:rFonts w:ascii="Menlo" w:hAnsi="Menlo" w:eastAsia="Arial Unicode MS" w:cs="Arial Unicode MS"/>
+          <w:rFonts w:ascii="Menlo" w:hAnsi="Menlo" w:eastAsia="PingFang SC" w:cs="PingFang SC"/>
           <w:b w:val="0"/>
           <w:color w:val="1F4D78"/>
           <w:sz w:val="20"/>
@@ -1273,14 +1273,14 @@
       </w:r>
       <w:r>
         <w:rPr>
-          <w:rFonts w:ascii="Arial Unicode MS" w:hAnsi="Arial Unicode MS" w:eastAsia="Arial Unicode MS" w:cs="Arial Unicode MS"/>
+          <w:rFonts w:ascii="Arial" w:hAnsi="Arial" w:eastAsia="PingFang SC" w:cs="PingFang SC"/>
           <w:b w:val="0"/>
         </w:rPr>
         <w:t>、</w:t>
       </w:r>
       <w:r>
         <w:rPr>
-          <w:rFonts w:ascii="Menlo" w:hAnsi="Menlo" w:eastAsia="Arial Unicode MS" w:cs="Arial Unicode MS"/>
+          <w:rFonts w:ascii="Menlo" w:hAnsi="Menlo" w:eastAsia="PingFang SC" w:cs="PingFang SC"/>
           <w:b w:val="0"/>
           <w:color w:val="1F4D78"/>
           <w:sz w:val="20"/>
@@ -1289,14 +1289,14 @@
       </w:r>
       <w:r>
         <w:rPr>
-          <w:rFonts w:ascii="Arial Unicode MS" w:hAnsi="Arial Unicode MS" w:eastAsia="Arial Unicode MS" w:cs="Arial Unicode MS"/>
+          <w:rFonts w:ascii="Arial" w:hAnsi="Arial" w:eastAsia="PingFang SC" w:cs="PingFang SC"/>
           <w:b w:val="0"/>
         </w:rPr>
         <w:t xml:space="preserve"> 或 </w:t>
       </w:r>
       <w:r>
         <w:rPr>
-          <w:rFonts w:ascii="Menlo" w:hAnsi="Menlo" w:eastAsia="Arial Unicode MS" w:cs="Arial Unicode MS"/>
+          <w:rFonts w:ascii="Menlo" w:hAnsi="Menlo" w:eastAsia="PingFang SC" w:cs="PingFang SC"/>
           <w:b w:val="0"/>
           <w:color w:val="1F4D78"/>
           <w:sz w:val="20"/>
@@ -1305,7 +1305,7 @@
       </w:r>
       <w:r>
         <w:rPr>
-          <w:rFonts w:ascii="Arial Unicode MS" w:hAnsi="Arial Unicode MS" w:eastAsia="Arial Unicode MS" w:cs="Arial Unicode MS"/>
+          <w:rFonts w:ascii="Arial" w:hAnsi="Arial" w:eastAsia="PingFang SC" w:cs="PingFang SC"/>
           <w:b w:val="0"/>
         </w:rPr>
         <w:t>。</w:t>
@@ -1321,14 +1321,14 @@
       </w:pPr>
       <w:r>
         <w:rPr>
-          <w:rFonts w:ascii="Arial Unicode MS" w:hAnsi="Arial Unicode MS" w:eastAsia="Arial Unicode MS" w:cs="Arial Unicode MS"/>
+          <w:rFonts w:ascii="Arial" w:hAnsi="Arial" w:eastAsia="PingFang SC" w:cs="PingFang SC"/>
           <w:b w:val="0"/>
         </w:rPr>
         <w:t>根据权益来源选择“质保补偿”、</w:t>
       </w:r>
       <w:r>
         <w:rPr>
-          <w:rFonts w:ascii="Menlo" w:hAnsi="Menlo" w:eastAsia="Arial Unicode MS" w:cs="Arial Unicode MS"/>
+          <w:rFonts w:ascii="Menlo" w:hAnsi="Menlo" w:eastAsia="PingFang SC" w:cs="PingFang SC"/>
           <w:b w:val="0"/>
           <w:color w:val="1F4D78"/>
           <w:sz w:val="20"/>
@@ -1337,7 +1337,7 @@
       </w:r>
       <w:r>
         <w:rPr>
-          <w:rFonts w:ascii="Arial Unicode MS" w:hAnsi="Arial Unicode MS" w:eastAsia="Arial Unicode MS" w:cs="Arial Unicode MS"/>
+          <w:rFonts w:ascii="Arial" w:hAnsi="Arial" w:eastAsia="PingFang SC" w:cs="PingFang SC"/>
           <w:b w:val="0"/>
         </w:rPr>
         <w:t xml:space="preserve"> 或对应的订阅分组。</w:t>
@@ -1353,7 +1353,7 @@
       </w:pPr>
       <w:r>
         <w:rPr>
-          <w:rFonts w:ascii="Arial Unicode MS" w:hAnsi="Arial Unicode MS" w:eastAsia="Arial Unicode MS" w:cs="Arial Unicode MS"/>
+          <w:rFonts w:ascii="Arial" w:hAnsi="Arial" w:eastAsia="PingFang SC" w:cs="PingFang SC"/>
           <w:b w:val="0"/>
         </w:rPr>
         <w:t>保存后回到密钥列表。</w:t>
@@ -1406,7 +1406,7 @@
       </w:pPr>
       <w:r>
         <w:rPr>
-          <w:rFonts w:ascii="Arial Unicode MS" w:hAnsi="Arial Unicode MS" w:eastAsia="Arial Unicode MS" w:cs="Arial Unicode MS"/>
+          <w:rFonts w:ascii="Arial" w:hAnsi="Arial" w:eastAsia="PingFang SC" w:cs="PingFang SC"/>
           <w:b w:val="0"/>
         </w:rPr>
         <w:t>图 4：密钥列表为空时，点击页面中的“创建密钥”。</w:t>
@@ -1459,7 +1459,7 @@
       </w:pPr>
       <w:r>
         <w:rPr>
-          <w:rFonts w:ascii="Arial Unicode MS" w:hAnsi="Arial Unicode MS" w:eastAsia="Arial Unicode MS" w:cs="Arial Unicode MS"/>
+          <w:rFonts w:ascii="Arial" w:hAnsi="Arial" w:eastAsia="PingFang SC" w:cs="PingFang SC"/>
           <w:b w:val="0"/>
         </w:rPr>
         <w:t>图 5：分组决定密钥使用的权益来源，选错会导致可用额度异常。</w:t>
@@ -1512,7 +1512,7 @@
       </w:pPr>
       <w:r>
         <w:rPr>
-          <w:rFonts w:ascii="Arial Unicode MS" w:hAnsi="Arial Unicode MS" w:eastAsia="Arial Unicode MS" w:cs="Arial Unicode MS"/>
+          <w:rFonts w:ascii="Arial" w:hAnsi="Arial" w:eastAsia="PingFang SC" w:cs="PingFang SC"/>
           <w:b w:val="0"/>
         </w:rPr>
         <w:t>图 6：创建后回到密钥列表，点击“使用密钥”。</w:t>
@@ -1524,7 +1524,7 @@
       </w:pPr>
       <w:r>
         <w:rPr>
-          <w:rFonts w:ascii="Arial Unicode MS" w:hAnsi="Arial Unicode MS" w:eastAsia="Arial Unicode MS" w:cs="Arial Unicode MS"/>
+          <w:rFonts w:ascii="Arial" w:hAnsi="Arial" w:eastAsia="PingFang SC" w:cs="PingFang SC"/>
           <w:b w:val="0"/>
         </w:rPr>
         <w:t>六、查看客户端接入配置</w:t>
@@ -1540,7 +1540,7 @@
       </w:pPr>
       <w:r>
         <w:rPr>
-          <w:rFonts w:ascii="Arial Unicode MS" w:hAnsi="Arial Unicode MS" w:eastAsia="Arial Unicode MS" w:cs="Arial Unicode MS"/>
+          <w:rFonts w:ascii="Arial" w:hAnsi="Arial" w:eastAsia="PingFang SC" w:cs="PingFang SC"/>
           <w:b w:val="0"/>
         </w:rPr>
         <w:t>在密钥列表的操作列点击“使用密钥”。</w:t>
@@ -1556,7 +1556,7 @@
       </w:pPr>
       <w:r>
         <w:rPr>
-          <w:rFonts w:ascii="Arial Unicode MS" w:hAnsi="Arial Unicode MS" w:eastAsia="Arial Unicode MS" w:cs="Arial Unicode MS"/>
+          <w:rFonts w:ascii="Arial" w:hAnsi="Arial" w:eastAsia="PingFang SC" w:cs="PingFang SC"/>
           <w:b w:val="0"/>
         </w:rPr>
         <w:t>在弹窗中选择需要配置的客户端。</w:t>
@@ -1572,14 +1572,14 @@
       </w:pPr>
       <w:r>
         <w:rPr>
-          <w:rFonts w:ascii="Arial Unicode MS" w:hAnsi="Arial Unicode MS" w:eastAsia="Arial Unicode MS" w:cs="Arial Unicode MS"/>
+          <w:rFonts w:ascii="Arial" w:hAnsi="Arial" w:eastAsia="PingFang SC" w:cs="PingFang SC"/>
           <w:b w:val="0"/>
         </w:rPr>
         <w:t xml:space="preserve">记录弹窗中给出的真实 </w:t>
       </w:r>
       <w:r>
         <w:rPr>
-          <w:rFonts w:ascii="Menlo" w:hAnsi="Menlo" w:eastAsia="Arial Unicode MS" w:cs="Arial Unicode MS"/>
+          <w:rFonts w:ascii="Menlo" w:hAnsi="Menlo" w:eastAsia="PingFang SC" w:cs="PingFang SC"/>
           <w:b w:val="0"/>
           <w:color w:val="1F4D78"/>
           <w:sz w:val="20"/>
@@ -1588,14 +1588,14 @@
       </w:r>
       <w:r>
         <w:rPr>
-          <w:rFonts w:ascii="Arial Unicode MS" w:hAnsi="Arial Unicode MS" w:eastAsia="Arial Unicode MS" w:cs="Arial Unicode MS"/>
+          <w:rFonts w:ascii="Arial" w:hAnsi="Arial" w:eastAsia="PingFang SC" w:cs="PingFang SC"/>
           <w:b w:val="0"/>
         </w:rPr>
         <w:t xml:space="preserve"> 和 </w:t>
       </w:r>
       <w:r>
         <w:rPr>
-          <w:rFonts w:ascii="Menlo" w:hAnsi="Menlo" w:eastAsia="Arial Unicode MS" w:cs="Arial Unicode MS"/>
+          <w:rFonts w:ascii="Menlo" w:hAnsi="Menlo" w:eastAsia="PingFang SC" w:cs="PingFang SC"/>
           <w:b w:val="0"/>
           <w:color w:val="1F4D78"/>
           <w:sz w:val="20"/>
@@ -1604,7 +1604,7 @@
       </w:r>
       <w:r>
         <w:rPr>
-          <w:rFonts w:ascii="Arial Unicode MS" w:hAnsi="Arial Unicode MS" w:eastAsia="Arial Unicode MS" w:cs="Arial Unicode MS"/>
+          <w:rFonts w:ascii="Arial" w:hAnsi="Arial" w:eastAsia="PingFang SC" w:cs="PingFang SC"/>
           <w:b w:val="0"/>
         </w:rPr>
         <w:t>。</w:t>
@@ -1620,7 +1620,7 @@
       </w:pPr>
       <w:r>
         <w:rPr>
-          <w:rFonts w:ascii="Arial Unicode MS" w:hAnsi="Arial Unicode MS" w:eastAsia="Arial Unicode MS" w:cs="Arial Unicode MS"/>
+          <w:rFonts w:ascii="Arial" w:hAnsi="Arial" w:eastAsia="PingFang SC" w:cs="PingFang SC"/>
           <w:b w:val="0"/>
         </w:rPr>
         <w:t>不要复制教程截图中的脱敏密钥。</w:t>
@@ -1636,7 +1636,7 @@
       </w:pPr>
       <w:r>
         <w:rPr>
-          <w:rFonts w:ascii="Arial Unicode MS" w:hAnsi="Arial Unicode MS" w:eastAsia="Arial Unicode MS" w:cs="Arial Unicode MS"/>
+          <w:rFonts w:ascii="Arial" w:hAnsi="Arial" w:eastAsia="PingFang SC" w:cs="PingFang SC"/>
           <w:b w:val="0"/>
         </w:rPr>
         <w:t>返回飞书目录，继续阅读对应的客户端子教程。</w:t>
@@ -1648,7 +1648,7 @@
       </w:pPr>
       <w:r>
         <w:rPr>
-          <w:rFonts w:ascii="Arial Unicode MS" w:hAnsi="Arial Unicode MS" w:eastAsia="Arial Unicode MS" w:cs="Arial Unicode MS"/>
+          <w:rFonts w:ascii="Arial" w:hAnsi="Arial" w:eastAsia="PingFang SC" w:cs="PingFang SC"/>
           <w:b w:val="0"/>
         </w:rPr>
         <w:t>七、常见问题</w:t>
@@ -1660,7 +1660,7 @@
       </w:pPr>
       <w:r>
         <w:rPr>
-          <w:rFonts w:ascii="Arial Unicode MS" w:hAnsi="Arial Unicode MS" w:eastAsia="Arial Unicode MS" w:cs="Arial Unicode MS"/>
+          <w:rFonts w:ascii="Arial" w:hAnsi="Arial" w:eastAsia="PingFang SC" w:cs="PingFang SC"/>
           <w:b/>
         </w:rPr>
         <w:t>Q1：一个账号能创建几把密钥？</w:t>
@@ -1672,7 +1672,7 @@
       </w:pPr>
       <w:r>
         <w:rPr>
-          <w:rFonts w:ascii="Arial Unicode MS" w:hAnsi="Arial Unicode MS" w:eastAsia="Arial Unicode MS" w:cs="Arial Unicode MS"/>
+          <w:rFonts w:ascii="Arial" w:hAnsi="Arial" w:eastAsia="PingFang SC" w:cs="PingFang SC"/>
           <w:b w:val="0"/>
         </w:rPr>
         <w:t>可创建多把，建议按客户端或设备分别命名，便于审计和单独吊销。</w:t>
@@ -1684,7 +1684,7 @@
       </w:pPr>
       <w:r>
         <w:rPr>
-          <w:rFonts w:ascii="Arial Unicode MS" w:hAnsi="Arial Unicode MS" w:eastAsia="Arial Unicode MS" w:cs="Arial Unicode MS"/>
+          <w:rFonts w:ascii="Arial" w:hAnsi="Arial" w:eastAsia="PingFang SC" w:cs="PingFang SC"/>
           <w:b/>
         </w:rPr>
         <w:t>Q2：泄露密钥怎么办？</w:t>
@@ -1696,7 +1696,7 @@
       </w:pPr>
       <w:r>
         <w:rPr>
-          <w:rFonts w:ascii="Arial Unicode MS" w:hAnsi="Arial Unicode MS" w:eastAsia="Arial Unicode MS" w:cs="Arial Unicode MS"/>
+          <w:rFonts w:ascii="Arial" w:hAnsi="Arial" w:eastAsia="PingFang SC" w:cs="PingFang SC"/>
           <w:b w:val="0"/>
         </w:rPr>
         <w:t>立即在“API 密钥”页面删除原密钥，重新创建一把，然后更新所有客户端的配置。</w:t>
@@ -1708,7 +1708,7 @@
       </w:pPr>
       <w:r>
         <w:rPr>
-          <w:rFonts w:ascii="Arial Unicode MS" w:hAnsi="Arial Unicode MS" w:eastAsia="Arial Unicode MS" w:cs="Arial Unicode MS"/>
+          <w:rFonts w:ascii="Arial" w:hAnsi="Arial" w:eastAsia="PingFang SC" w:cs="PingFang SC"/>
           <w:b/>
         </w:rPr>
         <w:t>Q3：Codex、Claude Code 和 Open Code 可以共用一把密钥吗？</w:t>
@@ -1720,7 +1720,7 @@
       </w:pPr>
       <w:r>
         <w:rPr>
-          <w:rFonts w:ascii="Arial Unicode MS" w:hAnsi="Arial Unicode MS" w:eastAsia="Arial Unicode MS" w:cs="Arial Unicode MS"/>
+          <w:rFonts w:ascii="Arial" w:hAnsi="Arial" w:eastAsia="PingFang SC" w:cs="PingFang SC"/>
           <w:b w:val="0"/>
         </w:rPr>
         <w:t>可以，但不建议。多把密钥可独立吊销，出现问题时更容易定位对应客户端。</w:t>
@@ -1732,7 +1732,7 @@
       </w:pPr>
       <w:r>
         <w:rPr>
-          <w:rFonts w:ascii="Arial Unicode MS" w:hAnsi="Arial Unicode MS" w:eastAsia="Arial Unicode MS" w:cs="Arial Unicode MS"/>
+          <w:rFonts w:ascii="Arial" w:hAnsi="Arial" w:eastAsia="PingFang SC" w:cs="PingFang SC"/>
           <w:b/>
         </w:rPr>
         <w:t>Q4：充值余额和订阅额度如何消费？</w:t>
@@ -1744,7 +1744,7 @@
       </w:pPr>
       <w:r>
         <w:rPr>
-          <w:rFonts w:ascii="Arial Unicode MS" w:hAnsi="Arial Unicode MS" w:eastAsia="Arial Unicode MS" w:cs="Arial Unicode MS"/>
+          <w:rFonts w:ascii="Arial" w:hAnsi="Arial" w:eastAsia="PingFang SC" w:cs="PingFang SC"/>
           <w:b w:val="0"/>
         </w:rPr>
         <w:t>额度模式按调用量从余额扣款；订阅模式在订阅周期或每日额度内使用，具体规则以中转后台实时显示为准。</w:t>
@@ -1756,7 +1756,7 @@
       </w:pPr>
       <w:r>
         <w:rPr>
-          <w:rFonts w:ascii="Arial Unicode MS" w:hAnsi="Arial Unicode MS" w:eastAsia="Arial Unicode MS" w:cs="Arial Unicode MS"/>
+          <w:rFonts w:ascii="Arial" w:hAnsi="Arial" w:eastAsia="PingFang SC" w:cs="PingFang SC"/>
           <w:b/>
         </w:rPr>
         <w:t>Q5：技术支持怎么联系？</w:t>
@@ -1768,7 +1768,7 @@
       </w:pPr>
       <w:r>
         <w:rPr>
-          <w:rFonts w:ascii="Arial Unicode MS" w:hAnsi="Arial Unicode MS" w:eastAsia="Arial Unicode MS" w:cs="Arial Unicode MS"/>
+          <w:rFonts w:ascii="Arial" w:hAnsi="Arial" w:eastAsia="PingFang SC" w:cs="PingFang SC"/>
           <w:b w:val="0"/>
         </w:rPr>
         <w:t>可扫描本文前面的交流群二维码，或登录中转站后在个人中心、站内公告、客服入口查看最新联系方式。</w:t>
@@ -1796,7 +1796,7 @@
     </w:pPr>
     <w:r>
       <w:rPr>
-        <w:rFonts w:ascii="Arial Unicode MS" w:hAnsi="Arial Unicode MS" w:eastAsia="Arial Unicode MS" w:cs="Arial Unicode MS"/>
+        <w:rFonts w:ascii="Arial" w:hAnsi="Arial" w:eastAsia="PingFang SC" w:cs="PingFang SC"/>
         <w:color w:val="5F6368"/>
         <w:sz w:val="17"/>
       </w:rPr>
@@ -1807,7 +1807,7 @@
     </w:r>
     <w:r>
       <w:rPr>
-        <w:rFonts w:ascii="Arial Unicode MS" w:hAnsi="Arial Unicode MS" w:eastAsia="Arial Unicode MS" w:cs="Arial Unicode MS"/>
+        <w:rFonts w:ascii="Arial" w:hAnsi="Arial" w:eastAsia="PingFang SC" w:cs="PingFang SC"/>
         <w:color w:val="5F6368"/>
         <w:sz w:val="17"/>
       </w:rPr>
@@ -1827,7 +1827,7 @@
     </w:pPr>
     <w:r>
       <w:rPr>
-        <w:rFonts w:ascii="Arial Unicode MS" w:hAnsi="Arial Unicode MS" w:eastAsia="Arial Unicode MS" w:cs="Arial Unicode MS"/>
+        <w:rFonts w:ascii="Arial" w:hAnsi="Arial" w:eastAsia="PingFang SC" w:cs="PingFang SC"/>
         <w:color w:val="5F6368"/>
         <w:sz w:val="17"/>
       </w:rPr>
@@ -2337,7 +2337,7 @@
       <w:spacing w:before="0" w:after="120" w:line="300" w:lineRule="auto"/>
     </w:pPr>
     <w:rPr>
-      <w:rFonts w:ascii="Arial Unicode MS" w:hAnsi="Arial Unicode MS" w:eastAsia="Arial Unicode MS" w:cs="Arial Unicode MS"/>
+      <w:rFonts w:ascii="Arial" w:hAnsi="Arial" w:eastAsia="PingFang SC" w:cs="PingFang SC"/>
       <w:sz w:val="22"/>
     </w:rPr>
   </w:style>
@@ -2400,7 +2400,7 @@
       <w:outlineLvl w:val="0"/>
     </w:pPr>
     <w:rPr>
-      <w:rFonts w:asciiTheme="majorHAnsi" w:eastAsiaTheme="majorEastAsia" w:hAnsiTheme="majorHAnsi" w:cstheme="majorBidi" w:ascii="Arial Unicode MS" w:hAnsi="Arial Unicode MS" w:eastAsia="Arial Unicode MS" w:cs="Arial Unicode MS"/>
+      <w:rFonts w:asciiTheme="majorHAnsi" w:eastAsiaTheme="majorEastAsia" w:hAnsiTheme="majorHAnsi" w:cstheme="majorBidi" w:ascii="Arial" w:hAnsi="Arial" w:eastAsia="PingFang SC" w:cs="PingFang SC"/>
       <w:b/>
       <w:bCs/>
       <w:color w:val="2E74B5"/>
@@ -2424,7 +2424,7 @@
       <w:outlineLvl w:val="1"/>
     </w:pPr>
     <w:rPr>
-      <w:rFonts w:asciiTheme="majorHAnsi" w:eastAsiaTheme="majorEastAsia" w:hAnsiTheme="majorHAnsi" w:cstheme="majorBidi" w:ascii="Arial Unicode MS" w:hAnsi="Arial Unicode MS" w:eastAsia="Arial Unicode MS" w:cs="Arial Unicode MS"/>
+      <w:rFonts w:asciiTheme="majorHAnsi" w:eastAsiaTheme="majorEastAsia" w:hAnsiTheme="majorHAnsi" w:cstheme="majorBidi" w:ascii="Arial" w:hAnsi="Arial" w:eastAsia="PingFang SC" w:cs="PingFang SC"/>
       <w:b/>
       <w:bCs/>
       <w:color w:val="2E74B5"/>
@@ -2448,7 +2448,7 @@
       <w:outlineLvl w:val="2"/>
     </w:pPr>
     <w:rPr>
-      <w:rFonts w:asciiTheme="majorHAnsi" w:eastAsiaTheme="majorEastAsia" w:hAnsiTheme="majorHAnsi" w:cstheme="majorBidi" w:ascii="Arial Unicode MS" w:hAnsi="Arial Unicode MS" w:eastAsia="Arial Unicode MS" w:cs="Arial Unicode MS"/>
+      <w:rFonts w:asciiTheme="majorHAnsi" w:eastAsiaTheme="majorEastAsia" w:hAnsiTheme="majorHAnsi" w:cstheme="majorBidi" w:ascii="Arial" w:hAnsi="Arial" w:eastAsia="PingFang SC" w:cs="PingFang SC"/>
       <w:b/>
       <w:bCs/>
       <w:color w:val="1F4D78"/>
@@ -3135,7 +3135,7 @@
       <w:jc w:val="center"/>
     </w:pPr>
     <w:rPr>
-      <w:rFonts w:ascii="Arial Unicode MS" w:hAnsi="Arial Unicode MS" w:eastAsia="Arial Unicode MS" w:cs="Arial Unicode MS"/>
+      <w:rFonts w:ascii="Arial" w:hAnsi="Arial" w:eastAsia="PingFang SC" w:cs="PingFang SC"/>
       <w:b/>
       <w:bCs/>
       <w:i w:val="0"/>

</xml_diff>

<commit_message>
docs: sync static guides from markdown
</commit_message>
<xml_diff>
--- a/docs/static-guides/feishu-word/01-中转注册与API密钥/00-中转注册与API密钥配置教程.docx
+++ b/docs/static-guides/feishu-word/01-中转注册与API密钥/00-中转注册与API密钥配置教程.docx
@@ -626,7 +626,7 @@
           <w:rFonts w:ascii="Arial" w:hAnsi="Arial" w:eastAsia="PingFang SC" w:cs="PingFang SC"/>
           <w:b w:val="0"/>
         </w:rPr>
-        <w:t>本教程同时适用于质保补发的中转兑换码、站内充值或订阅，以及在链动小铺购买的额度包或订阅包。</w:t>
+        <w:t>本教程适用于小铺购买的额度或订阅兑换码、站内充值或订阅。</w:t>
       </w:r>
     </w:p>
     <w:p>
@@ -638,77 +638,215 @@
           <w:rFonts w:ascii="Arial" w:hAnsi="Arial" w:eastAsia="PingFang SC" w:cs="PingFang SC"/>
           <w:b w:val="0"/>
         </w:rPr>
-        <w:t>API 密钥分组选择规则：</w:t>
+        <w:t>API 密钥分组选择与计费模式：</w:t>
       </w:r>
     </w:p>
+    <w:tbl>
+      <w:tblPr>
+        <w:tblStyle w:val="TableGrid"/>
+        <w:tblW w:type="dxa" w:w="9360"/>
+        <w:jc w:val="left"/>
+        <w:tblLayout w:type="fixed"/>
+        <w:tblLook w:firstColumn="1" w:firstRow="1" w:lastColumn="0" w:lastRow="0" w:noHBand="0" w:noVBand="1" w:val="04A0"/>
+        <w:tblInd w:w="120" w:type="dxa"/>
+        <w:tblCellMar>
+          <w:top w:w="80" w:type="dxa"/>
+          <w:bottom w:w="80" w:type="dxa"/>
+          <w:start w:w="120" w:type="dxa"/>
+          <w:end w:w="120" w:type="dxa"/>
+        </w:tblCellMar>
+      </w:tblPr>
+      <w:tblGrid>
+        <w:gridCol w:w="3120"/>
+        <w:gridCol w:w="3120"/>
+        <w:gridCol w:w="3120"/>
+      </w:tblGrid>
+      <w:tr>
+        <w:trPr>
+          <w:cantSplit/>
+          <w:tblHeader w:val="true"/>
+        </w:trPr>
+        <w:tc>
+          <w:tcPr>
+            <w:tcW w:type="dxa" w:w="3120"/>
+            <w:vAlign w:val="center"/>
+            <w:shd w:fill="E8EEF5"/>
+          </w:tcPr>
+          <w:p>
+            <w:pPr>
+              <w:spacing w:before="0" w:after="0" w:line="276" w:lineRule="auto"/>
+            </w:pPr>
+            <w:r>
+              <w:rPr>
+                <w:rFonts w:ascii="Arial" w:hAnsi="Arial" w:eastAsia="PingFang SC" w:cs="PingFang SC"/>
+                <w:b/>
+              </w:rPr>
+              <w:t>计费模式</w:t>
+            </w:r>
+          </w:p>
+        </w:tc>
+        <w:tc>
+          <w:tcPr>
+            <w:tcW w:type="dxa" w:w="3120"/>
+            <w:vAlign w:val="center"/>
+            <w:shd w:fill="E8EEF5"/>
+          </w:tcPr>
+          <w:p>
+            <w:pPr>
+              <w:spacing w:before="0" w:after="0" w:line="276" w:lineRule="auto"/>
+            </w:pPr>
+            <w:r>
+              <w:rPr>
+                <w:rFonts w:ascii="Arial" w:hAnsi="Arial" w:eastAsia="PingFang SC" w:cs="PingFang SC"/>
+                <w:b/>
+              </w:rPr>
+              <w:t>密钥分组</w:t>
+            </w:r>
+          </w:p>
+        </w:tc>
+        <w:tc>
+          <w:tcPr>
+            <w:tcW w:type="dxa" w:w="3120"/>
+            <w:vAlign w:val="center"/>
+            <w:shd w:fill="E8EEF5"/>
+          </w:tcPr>
+          <w:p>
+            <w:pPr>
+              <w:spacing w:before="0" w:after="0" w:line="276" w:lineRule="auto"/>
+            </w:pPr>
+            <w:r>
+              <w:rPr>
+                <w:rFonts w:ascii="Arial" w:hAnsi="Arial" w:eastAsia="PingFang SC" w:cs="PingFang SC"/>
+                <w:b/>
+              </w:rPr>
+              <w:t>额度规则</w:t>
+            </w:r>
+          </w:p>
+        </w:tc>
+      </w:tr>
+      <w:tr>
+        <w:trPr>
+          <w:cantSplit/>
+        </w:trPr>
+        <w:tc>
+          <w:tcPr>
+            <w:tcW w:type="dxa" w:w="3120"/>
+            <w:vAlign w:val="center"/>
+          </w:tcPr>
+          <w:p>
+            <w:pPr>
+              <w:spacing w:before="0" w:after="0" w:line="276" w:lineRule="auto"/>
+            </w:pPr>
+            <w:r>
+              <w:rPr>
+                <w:rFonts w:ascii="Arial" w:hAnsi="Arial" w:eastAsia="PingFang SC" w:cs="PingFang SC"/>
+                <w:b w:val="0"/>
+              </w:rPr>
+              <w:t>订阅模式</w:t>
+            </w:r>
+          </w:p>
+        </w:tc>
+        <w:tc>
+          <w:tcPr>
+            <w:tcW w:type="dxa" w:w="3120"/>
+            <w:vAlign w:val="center"/>
+          </w:tcPr>
+          <w:p>
+            <w:pPr>
+              <w:spacing w:before="0" w:after="0" w:line="276" w:lineRule="auto"/>
+            </w:pPr>
+            <w:r>
+              <w:rPr>
+                <w:rFonts w:ascii="Arial" w:hAnsi="Arial" w:eastAsia="PingFang SC" w:cs="PingFang SC"/>
+                <w:b w:val="0"/>
+              </w:rPr>
+              <w:t>选择相应订阅分组（订阅 xx 刀）</w:t>
+            </w:r>
+          </w:p>
+        </w:tc>
+        <w:tc>
+          <w:tcPr>
+            <w:tcW w:type="dxa" w:w="3120"/>
+            <w:vAlign w:val="center"/>
+          </w:tcPr>
+          <w:p>
+            <w:pPr>
+              <w:spacing w:before="0" w:after="0" w:line="276" w:lineRule="auto"/>
+            </w:pPr>
+            <w:r>
+              <w:rPr>
+                <w:rFonts w:ascii="Arial" w:hAnsi="Arial" w:eastAsia="PingFang SC" w:cs="PingFang SC"/>
+                <w:b w:val="0"/>
+              </w:rPr>
+              <w:t>每天有固定额度，通常在每天 0 点后刷新。</w:t>
+            </w:r>
+          </w:p>
+        </w:tc>
+      </w:tr>
+      <w:tr>
+        <w:trPr>
+          <w:cantSplit/>
+        </w:trPr>
+        <w:tc>
+          <w:tcPr>
+            <w:tcW w:type="dxa" w:w="3120"/>
+            <w:vAlign w:val="center"/>
+          </w:tcPr>
+          <w:p>
+            <w:pPr>
+              <w:spacing w:before="0" w:after="0" w:line="276" w:lineRule="auto"/>
+            </w:pPr>
+            <w:r>
+              <w:rPr>
+                <w:rFonts w:ascii="Arial" w:hAnsi="Arial" w:eastAsia="PingFang SC" w:cs="PingFang SC"/>
+                <w:b w:val="0"/>
+              </w:rPr>
+              <w:t>额度模式</w:t>
+            </w:r>
+          </w:p>
+        </w:tc>
+        <w:tc>
+          <w:tcPr>
+            <w:tcW w:type="dxa" w:w="3120"/>
+            <w:vAlign w:val="center"/>
+          </w:tcPr>
+          <w:p>
+            <w:pPr>
+              <w:spacing w:before="0" w:after="0" w:line="276" w:lineRule="auto"/>
+            </w:pPr>
+            <w:r>
+              <w:rPr>
+                <w:rFonts w:ascii="Arial" w:hAnsi="Arial" w:eastAsia="PingFang SC" w:cs="PingFang SC"/>
+                <w:b w:val="0"/>
+              </w:rPr>
+              <w:t>选择相应消耗额度的分组（OpenAI-Plus、Pro、Claude 等）</w:t>
+            </w:r>
+          </w:p>
+        </w:tc>
+        <w:tc>
+          <w:tcPr>
+            <w:tcW w:type="dxa" w:w="3120"/>
+            <w:vAlign w:val="center"/>
+          </w:tcPr>
+          <w:p>
+            <w:pPr>
+              <w:spacing w:before="0" w:after="0" w:line="276" w:lineRule="auto"/>
+            </w:pPr>
+            <w:r>
+              <w:rPr>
+                <w:rFonts w:ascii="Arial" w:hAnsi="Arial" w:eastAsia="PingFang SC" w:cs="PingFang SC"/>
+                <w:b w:val="0"/>
+              </w:rPr>
+              <w:t>调用时按实际消耗从网站账户余额中扣费。</w:t>
+            </w:r>
+          </w:p>
+        </w:tc>
+      </w:tr>
+    </w:tbl>
     <w:p>
       <w:pPr>
-        <w:spacing w:after="80" w:line="300" w:lineRule="auto"/>
-        <w:numPr>
-          <w:ilvl w:val="0"/>
-          <w:numId w:val="11"/>
-        </w:numPr>
+        <w:spacing w:after="40"/>
       </w:pPr>
-      <w:r>
-        <w:rPr>
-          <w:rFonts w:ascii="Arial" w:hAnsi="Arial" w:eastAsia="PingFang SC" w:cs="PingFang SC"/>
-          <w:b/>
-        </w:rPr>
-        <w:t>链动小铺额度包：选择 `GPT` 分组</w:t>
-      </w:r>
-      <w:r>
-        <w:rPr>
-          <w:rFonts w:ascii="Arial" w:hAnsi="Arial" w:eastAsia="PingFang SC" w:cs="PingFang SC"/>
-          <w:b w:val="0"/>
-        </w:rPr>
-        <w:t xml:space="preserve"> 额度包使用时从网站账户余额中扣费。</w:t>
-      </w:r>
-    </w:p>
-    <w:p>
-      <w:pPr>
-        <w:spacing w:after="80" w:line="300" w:lineRule="auto"/>
-        <w:numPr>
-          <w:ilvl w:val="0"/>
-          <w:numId w:val="11"/>
-        </w:numPr>
-      </w:pPr>
-      <w:r>
-        <w:rPr>
-          <w:rFonts w:ascii="Arial" w:hAnsi="Arial" w:eastAsia="PingFang SC" w:cs="PingFang SC"/>
-          <w:b/>
-        </w:rPr>
-        <w:t>链动小铺订阅包：选择对应订阅分组</w:t>
-      </w:r>
-      <w:r>
-        <w:rPr>
-          <w:rFonts w:ascii="Arial" w:hAnsi="Arial" w:eastAsia="PingFang SC" w:cs="PingFang SC"/>
-          <w:b w:val="0"/>
-        </w:rPr>
-        <w:t xml:space="preserve"> 选择与已购买套餐对应的订阅分组。</w:t>
-      </w:r>
-    </w:p>
-    <w:p>
-      <w:pPr>
-        <w:spacing w:after="80" w:line="300" w:lineRule="auto"/>
-        <w:numPr>
-          <w:ilvl w:val="0"/>
-          <w:numId w:val="11"/>
-        </w:numPr>
-      </w:pPr>
-      <w:r>
-        <w:rPr>
-          <w:rFonts w:ascii="Arial" w:hAnsi="Arial" w:eastAsia="PingFang SC" w:cs="PingFang SC"/>
-          <w:b/>
-        </w:rPr>
-        <w:t>质保补发码：选择“质保补偿”</w:t>
-      </w:r>
-      <w:r>
-        <w:rPr>
-          <w:rFonts w:ascii="Arial" w:hAnsi="Arial" w:eastAsia="PingFang SC" w:cs="PingFang SC"/>
-          <w:b w:val="0"/>
-        </w:rPr>
-        <w:t xml:space="preserve"> 质保网站补发的中转兑换码使用订阅权益，不扣除额度余额。</w:t>
-      </w:r>
     </w:p>
     <w:p>
       <w:pPr>
@@ -719,65 +857,7 @@
           <w:rFonts w:ascii="Arial" w:hAnsi="Arial" w:eastAsia="PingFang SC" w:cs="PingFang SC"/>
           <w:b w:val="0"/>
         </w:rPr>
-        <w:t>计费模式提醒：</w:t>
-      </w:r>
-    </w:p>
-    <w:p>
-      <w:pPr>
-        <w:spacing w:after="80" w:line="300" w:lineRule="auto"/>
-        <w:numPr>
-          <w:ilvl w:val="0"/>
-          <w:numId w:val="12"/>
-        </w:numPr>
-      </w:pPr>
-      <w:r>
-        <w:rPr>
-          <w:rFonts w:ascii="Arial" w:hAnsi="Arial" w:eastAsia="PingFang SC" w:cs="PingFang SC"/>
-          <w:b/>
-        </w:rPr>
-        <w:t>订阅模式：</w:t>
-      </w:r>
-      <w:r>
-        <w:rPr>
-          <w:rFonts w:ascii="Arial" w:hAnsi="Arial" w:eastAsia="PingFang SC" w:cs="PingFang SC"/>
-          <w:b w:val="0"/>
-        </w:rPr>
-        <w:t>每天有固定额度，通常在每天 0 点后刷新。</w:t>
-      </w:r>
-    </w:p>
-    <w:p>
-      <w:pPr>
-        <w:spacing w:after="80" w:line="300" w:lineRule="auto"/>
-        <w:numPr>
-          <w:ilvl w:val="0"/>
-          <w:numId w:val="12"/>
-        </w:numPr>
-      </w:pPr>
-      <w:r>
-        <w:rPr>
-          <w:rFonts w:ascii="Arial" w:hAnsi="Arial" w:eastAsia="PingFang SC" w:cs="PingFang SC"/>
-          <w:b/>
-        </w:rPr>
-        <w:t>额度模式：</w:t>
-      </w:r>
-      <w:r>
-        <w:rPr>
-          <w:rFonts w:ascii="Arial" w:hAnsi="Arial" w:eastAsia="PingFang SC" w:cs="PingFang SC"/>
-          <w:b w:val="0"/>
-        </w:rPr>
-        <w:t>调用时按实际消耗从网站账户余额中扣费。</w:t>
-      </w:r>
-    </w:p>
-    <w:p>
-      <w:pPr>
-        <w:widowControl/>
-      </w:pPr>
-      <w:r>
-        <w:rPr>
-          <w:rFonts w:ascii="Arial" w:hAnsi="Arial" w:eastAsia="PingFang SC" w:cs="PingFang SC"/>
-          <w:b w:val="0"/>
-        </w:rPr>
-        <w:t>需要额外购买额度包时，可使用链动小铺卡密自助购买地址：</w:t>
+        <w:t>需要购买兑换码时，可使用小铺卡密自助购买地址：</w:t>
       </w:r>
       <w:hyperlink r:id="rId11">
         <w:r>
@@ -860,7 +940,7 @@
         <w:spacing w:after="80" w:line="300" w:lineRule="auto"/>
         <w:numPr>
           <w:ilvl w:val="0"/>
-          <w:numId w:val="13"/>
+          <w:numId w:val="11"/>
         </w:numPr>
       </w:pPr>
       <w:r>
@@ -886,7 +966,7 @@
         <w:spacing w:after="80" w:line="300" w:lineRule="auto"/>
         <w:numPr>
           <w:ilvl w:val="0"/>
-          <w:numId w:val="13"/>
+          <w:numId w:val="11"/>
         </w:numPr>
       </w:pPr>
       <w:r>
@@ -902,7 +982,7 @@
         <w:spacing w:after="80" w:line="300" w:lineRule="auto"/>
         <w:numPr>
           <w:ilvl w:val="0"/>
-          <w:numId w:val="13"/>
+          <w:numId w:val="11"/>
         </w:numPr>
       </w:pPr>
       <w:r>
@@ -995,7 +1075,7 @@
         <w:spacing w:after="80" w:line="300" w:lineRule="auto"/>
         <w:numPr>
           <w:ilvl w:val="0"/>
-          <w:numId w:val="14"/>
+          <w:numId w:val="12"/>
         </w:numPr>
       </w:pPr>
       <w:r>
@@ -1021,7 +1101,7 @@
         <w:spacing w:after="80" w:line="300" w:lineRule="auto"/>
         <w:numPr>
           <w:ilvl w:val="0"/>
-          <w:numId w:val="14"/>
+          <w:numId w:val="12"/>
         </w:numPr>
       </w:pPr>
       <w:r>
@@ -1037,7 +1117,7 @@
         <w:spacing w:after="80" w:line="300" w:lineRule="auto"/>
         <w:numPr>
           <w:ilvl w:val="0"/>
-          <w:numId w:val="14"/>
+          <w:numId w:val="12"/>
         </w:numPr>
       </w:pPr>
       <w:r>
@@ -1053,7 +1133,7 @@
         <w:spacing w:after="80" w:line="300" w:lineRule="auto"/>
         <w:numPr>
           <w:ilvl w:val="0"/>
-          <w:numId w:val="14"/>
+          <w:numId w:val="12"/>
         </w:numPr>
       </w:pPr>
       <w:r>
@@ -1136,59 +1216,6 @@
     </w:p>
     <w:p>
       <w:pPr>
-        <w:keepNext/>
-        <w:spacing w:before="80" w:after="40"/>
-        <w:jc w:val="center"/>
-      </w:pPr>
-      <w:r>
-        <w:drawing>
-          <wp:inline xmlns:a="http://schemas.openxmlformats.org/drawingml/2006/main" xmlns:pic="http://schemas.openxmlformats.org/drawingml/2006/picture">
-            <wp:extent cx="5623560" cy="1630175"/>
-            <wp:docPr id="4" name="Picture 4" descr="中转账户最近活动显示订阅兑换记录" title="中转账户最近活动显示订阅兑换记录"/>
-            <wp:cNvGraphicFramePr>
-              <a:graphicFrameLocks noChangeAspect="1"/>
-            </wp:cNvGraphicFramePr>
-            <a:graphic>
-              <a:graphicData uri="http://schemas.openxmlformats.org/drawingml/2006/picture">
-                <pic:pic>
-                  <pic:nvPicPr>
-                    <pic:cNvPr id="0" name="image-17.png"/>
-                    <pic:cNvPicPr/>
-                  </pic:nvPicPr>
-                  <pic:blipFill>
-                    <a:blip r:embed="rId18"/>
-                    <a:stretch>
-                      <a:fillRect/>
-                    </a:stretch>
-                  </pic:blipFill>
-                  <pic:spPr>
-                    <a:xfrm>
-                      <a:off x="0" y="0"/>
-                      <a:ext cx="5623560" cy="1630175"/>
-                    </a:xfrm>
-                    <a:prstGeom prst="rect"/>
-                  </pic:spPr>
-                </pic:pic>
-              </a:graphicData>
-            </a:graphic>
-          </wp:inline>
-        </w:drawing>
-      </w:r>
-    </w:p>
-    <w:p>
-      <w:pPr>
-        <w:pStyle w:val="Caption"/>
-      </w:pPr>
-      <w:r>
-        <w:rPr>
-          <w:rFonts w:ascii="Arial" w:hAnsi="Arial" w:eastAsia="PingFang SC" w:cs="PingFang SC"/>
-          <w:b w:val="0"/>
-        </w:rPr>
-        <w:t>图 3：兑换记录会出现在最近活动中，可用于确认权益是否到账。</w:t>
-      </w:r>
-    </w:p>
-    <w:p>
-      <w:pPr>
         <w:pStyle w:val="Heading2"/>
       </w:pPr>
       <w:r>
@@ -1219,7 +1246,7 @@
         <w:spacing w:after="80" w:line="300" w:lineRule="auto"/>
         <w:numPr>
           <w:ilvl w:val="0"/>
-          <w:numId w:val="15"/>
+          <w:numId w:val="13"/>
         </w:numPr>
       </w:pPr>
       <w:r>
@@ -1229,7 +1256,7 @@
         </w:rPr>
         <w:t xml:space="preserve">登录后打开 </w:t>
       </w:r>
-      <w:hyperlink r:id="rId19">
+      <w:hyperlink r:id="rId18">
         <w:r>
           <w:rPr>
             <w:rFonts w:ascii="Arial" w:hAnsi="Arial" w:eastAsia="PingFang SC" w:cs="PingFang SC"/>
@@ -1252,7 +1279,7 @@
         <w:spacing w:after="80" w:line="300" w:lineRule="auto"/>
         <w:numPr>
           <w:ilvl w:val="0"/>
-          <w:numId w:val="15"/>
+          <w:numId w:val="13"/>
         </w:numPr>
       </w:pPr>
       <w:r>
@@ -1316,7 +1343,7 @@
         <w:spacing w:after="80" w:line="300" w:lineRule="auto"/>
         <w:numPr>
           <w:ilvl w:val="0"/>
-          <w:numId w:val="15"/>
+          <w:numId w:val="13"/>
         </w:numPr>
       </w:pPr>
       <w:r>
@@ -1324,7 +1351,7 @@
           <w:rFonts w:ascii="Arial" w:hAnsi="Arial" w:eastAsia="PingFang SC" w:cs="PingFang SC"/>
           <w:b w:val="0"/>
         </w:rPr>
-        <w:t>根据权益来源选择“质保补偿”、</w:t>
+        <w:t xml:space="preserve">根据计费模式选择对应的订阅分组，或 </w:t>
       </w:r>
       <w:r>
         <w:rPr>
@@ -1333,14 +1360,46 @@
           <w:color w:val="1F4D78"/>
           <w:sz w:val="20"/>
         </w:rPr>
-        <w:t>GPT</w:t>
+        <w:t>OpenAI-Plus</w:t>
       </w:r>
       <w:r>
         <w:rPr>
           <w:rFonts w:ascii="Arial" w:hAnsi="Arial" w:eastAsia="PingFang SC" w:cs="PingFang SC"/>
           <w:b w:val="0"/>
         </w:rPr>
-        <w:t xml:space="preserve"> 或对应的订阅分组。</w:t>
+        <w:t>、</w:t>
+      </w:r>
+      <w:r>
+        <w:rPr>
+          <w:rFonts w:ascii="Menlo" w:hAnsi="Menlo" w:eastAsia="PingFang SC" w:cs="PingFang SC"/>
+          <w:b w:val="0"/>
+          <w:color w:val="1F4D78"/>
+          <w:sz w:val="20"/>
+        </w:rPr>
+        <w:t>Pro</w:t>
+      </w:r>
+      <w:r>
+        <w:rPr>
+          <w:rFonts w:ascii="Arial" w:hAnsi="Arial" w:eastAsia="PingFang SC" w:cs="PingFang SC"/>
+          <w:b w:val="0"/>
+        </w:rPr>
+        <w:t>、</w:t>
+      </w:r>
+      <w:r>
+        <w:rPr>
+          <w:rFonts w:ascii="Menlo" w:hAnsi="Menlo" w:eastAsia="PingFang SC" w:cs="PingFang SC"/>
+          <w:b w:val="0"/>
+          <w:color w:val="1F4D78"/>
+          <w:sz w:val="20"/>
+        </w:rPr>
+        <w:t>Claude</w:t>
+      </w:r>
+      <w:r>
+        <w:rPr>
+          <w:rFonts w:ascii="Arial" w:hAnsi="Arial" w:eastAsia="PingFang SC" w:cs="PingFang SC"/>
+          <w:b w:val="0"/>
+        </w:rPr>
+        <w:t xml:space="preserve"> 等额度分组；具体名称以中转后台实际显示为准。</w:t>
       </w:r>
     </w:p>
     <w:p>
@@ -1348,7 +1407,7 @@
         <w:spacing w:after="80" w:line="300" w:lineRule="auto"/>
         <w:numPr>
           <w:ilvl w:val="0"/>
-          <w:numId w:val="15"/>
+          <w:numId w:val="13"/>
         </w:numPr>
       </w:pPr>
       <w:r>
@@ -1369,7 +1428,7 @@
         <w:drawing>
           <wp:inline xmlns:a="http://schemas.openxmlformats.org/drawingml/2006/main" xmlns:pic="http://schemas.openxmlformats.org/drawingml/2006/picture">
             <wp:extent cx="5486400" cy="3327400"/>
-            <wp:docPr id="5" name="Picture 5" descr="API 密钥页面暂无密钥并显示创建密钥按钮" title="API 密钥页面暂无密钥并显示创建密钥按钮"/>
+            <wp:docPr id="4" name="Picture 4" descr="API 密钥页面暂无密钥并显示创建密钥按钮" title="API 密钥页面暂无密钥并显示创建密钥按钮"/>
             <wp:cNvGraphicFramePr>
               <a:graphicFrameLocks noChangeAspect="1"/>
             </wp:cNvGraphicFramePr>
@@ -1381,7 +1440,7 @@
                     <pic:cNvPicPr/>
                   </pic:nvPicPr>
                   <pic:blipFill>
-                    <a:blip r:embed="rId20"/>
+                    <a:blip r:embed="rId19"/>
                     <a:stretch>
                       <a:fillRect/>
                     </a:stretch>
@@ -1409,7 +1468,7 @@
           <w:rFonts w:ascii="Arial" w:hAnsi="Arial" w:eastAsia="PingFang SC" w:cs="PingFang SC"/>
           <w:b w:val="0"/>
         </w:rPr>
-        <w:t>图 4：密钥列表为空时，点击页面中的“创建密钥”。</w:t>
+        <w:t>图 3：密钥列表为空时，点击页面中的“创建密钥”。</w:t>
       </w:r>
     </w:p>
     <w:p>
@@ -1421,8 +1480,8 @@
       <w:r>
         <w:drawing>
           <wp:inline xmlns:a="http://schemas.openxmlformats.org/drawingml/2006/main" xmlns:pic="http://schemas.openxmlformats.org/drawingml/2006/picture">
-            <wp:extent cx="5350132" cy="6537960"/>
-            <wp:docPr id="6" name="Picture 6" descr="创建密钥弹窗中选择 API 分组" title="创建密钥弹窗中选择 API 分组"/>
+            <wp:extent cx="5568452" cy="6537960"/>
+            <wp:docPr id="5" name="Picture 5" descr="创建密钥弹窗中选择 API 分组" title="创建密钥弹窗中选择 API 分组"/>
             <wp:cNvGraphicFramePr>
               <a:graphicFrameLocks noChangeAspect="1"/>
             </wp:cNvGraphicFramePr>
@@ -1430,11 +1489,11 @@
               <a:graphicData uri="http://schemas.openxmlformats.org/drawingml/2006/picture">
                 <pic:pic>
                   <pic:nvPicPr>
-                    <pic:cNvPr id="0" name="image-19.png"/>
+                    <pic:cNvPr id="0" name="image-15.png"/>
                     <pic:cNvPicPr/>
                   </pic:nvPicPr>
                   <pic:blipFill>
-                    <a:blip r:embed="rId21"/>
+                    <a:blip r:embed="rId20"/>
                     <a:stretch>
                       <a:fillRect/>
                     </a:stretch>
@@ -1442,7 +1501,7 @@
                   <pic:spPr>
                     <a:xfrm>
                       <a:off x="0" y="0"/>
-                      <a:ext cx="5350132" cy="6537960"/>
+                      <a:ext cx="5568452" cy="6537960"/>
                     </a:xfrm>
                     <a:prstGeom prst="rect"/>
                   </pic:spPr>
@@ -1462,7 +1521,7 @@
           <w:rFonts w:ascii="Arial" w:hAnsi="Arial" w:eastAsia="PingFang SC" w:cs="PingFang SC"/>
           <w:b w:val="0"/>
         </w:rPr>
-        <w:t>图 5：分组决定密钥使用的权益来源，选错会导致可用额度异常。</w:t>
+        <w:t>图 4：分组决定密钥使用的权益来源，选错会导致可用额度异常。</w:t>
       </w:r>
     </w:p>
     <w:p>
@@ -1475,7 +1534,7 @@
         <w:drawing>
           <wp:inline xmlns:a="http://schemas.openxmlformats.org/drawingml/2006/main" xmlns:pic="http://schemas.openxmlformats.org/drawingml/2006/picture">
             <wp:extent cx="5623560" cy="1700492"/>
-            <wp:docPr id="7" name="Picture 7" descr="密钥列表使用密钥入口" title="密钥列表使用密钥入口"/>
+            <wp:docPr id="6" name="Picture 6" descr="密钥列表使用密钥入口" title="密钥列表使用密钥入口"/>
             <wp:cNvGraphicFramePr>
               <a:graphicFrameLocks noChangeAspect="1"/>
             </wp:cNvGraphicFramePr>
@@ -1487,7 +1546,7 @@
                     <pic:cNvPicPr/>
                   </pic:nvPicPr>
                   <pic:blipFill>
-                    <a:blip r:embed="rId22"/>
+                    <a:blip r:embed="rId21"/>
                     <a:stretch>
                       <a:fillRect/>
                     </a:stretch>
@@ -1515,7 +1574,7 @@
           <w:rFonts w:ascii="Arial" w:hAnsi="Arial" w:eastAsia="PingFang SC" w:cs="PingFang SC"/>
           <w:b w:val="0"/>
         </w:rPr>
-        <w:t>图 6：创建后回到密钥列表，点击“使用密钥”。</w:t>
+        <w:t>图 5：创建后回到密钥列表，点击“使用密钥”。</w:t>
       </w:r>
     </w:p>
     <w:p>
@@ -1535,7 +1594,7 @@
         <w:spacing w:after="80" w:line="300" w:lineRule="auto"/>
         <w:numPr>
           <w:ilvl w:val="0"/>
-          <w:numId w:val="16"/>
+          <w:numId w:val="14"/>
         </w:numPr>
       </w:pPr>
       <w:r>
@@ -1551,7 +1610,7 @@
         <w:spacing w:after="80" w:line="300" w:lineRule="auto"/>
         <w:numPr>
           <w:ilvl w:val="0"/>
-          <w:numId w:val="16"/>
+          <w:numId w:val="14"/>
         </w:numPr>
       </w:pPr>
       <w:r>
@@ -1567,7 +1626,7 @@
         <w:spacing w:after="80" w:line="300" w:lineRule="auto"/>
         <w:numPr>
           <w:ilvl w:val="0"/>
-          <w:numId w:val="16"/>
+          <w:numId w:val="14"/>
         </w:numPr>
       </w:pPr>
       <w:r>
@@ -1615,7 +1674,7 @@
         <w:spacing w:after="80" w:line="300" w:lineRule="auto"/>
         <w:numPr>
           <w:ilvl w:val="0"/>
-          <w:numId w:val="16"/>
+          <w:numId w:val="14"/>
         </w:numPr>
       </w:pPr>
       <w:r>
@@ -1628,18 +1687,14 @@
     </w:p>
     <w:p>
       <w:pPr>
-        <w:spacing w:after="80" w:line="300" w:lineRule="auto"/>
-        <w:numPr>
-          <w:ilvl w:val="0"/>
-          <w:numId w:val="16"/>
-        </w:numPr>
+        <w:widowControl/>
       </w:pPr>
       <w:r>
         <w:rPr>
           <w:rFonts w:ascii="Arial" w:hAnsi="Arial" w:eastAsia="PingFang SC" w:cs="PingFang SC"/>
           <w:b w:val="0"/>
         </w:rPr>
-        <w:t>返回飞书目录，继续阅读对应的客户端子教程。</w:t>
+        <w:t>完成后，继续阅读第一节列出的对应客户端子教程。</w:t>
       </w:r>
     </w:p>
     <w:p>
@@ -2060,8 +2115,8 @@
     <w:multiLevelType w:val="singleLevel"/>
     <w:lvl w:ilvl="0">
       <w:start w:val="1"/>
-      <w:numFmt w:val="bullet"/>
-      <w:lvlText w:val="•"/>
+      <w:numFmt w:val="decimal"/>
+      <w:lvlText w:val="%1."/>
       <w:lvlJc w:val="left"/>
       <w:pPr>
         <w:tabs>
@@ -2079,8 +2134,8 @@
     <w:multiLevelType w:val="singleLevel"/>
     <w:lvl w:ilvl="0">
       <w:start w:val="1"/>
-      <w:numFmt w:val="bullet"/>
-      <w:lvlText w:val="•"/>
+      <w:numFmt w:val="decimal"/>
+      <w:lvlText w:val="%1."/>
       <w:lvlJc w:val="left"/>
       <w:pPr>
         <w:tabs>
@@ -2131,44 +2186,6 @@
   </w:abstractNum>
   <w:num w:numId="14">
     <w:abstractNumId w:val="13"/>
-  </w:num>
-  <w:abstractNum w:abstractNumId="14">
-    <w:multiLevelType w:val="singleLevel"/>
-    <w:lvl w:ilvl="0">
-      <w:start w:val="1"/>
-      <w:numFmt w:val="decimal"/>
-      <w:lvlText w:val="%1."/>
-      <w:lvlJc w:val="left"/>
-      <w:pPr>
-        <w:tabs>
-          <w:tab w:val="num" w:pos="540"/>
-        </w:tabs>
-        <w:ind w:left="540" w:hanging="270"/>
-        <w:spacing w:after="80" w:line="300" w:lineRule="auto"/>
-      </w:pPr>
-    </w:lvl>
-  </w:abstractNum>
-  <w:num w:numId="15">
-    <w:abstractNumId w:val="14"/>
-  </w:num>
-  <w:abstractNum w:abstractNumId="15">
-    <w:multiLevelType w:val="singleLevel"/>
-    <w:lvl w:ilvl="0">
-      <w:start w:val="1"/>
-      <w:numFmt w:val="decimal"/>
-      <w:lvlText w:val="%1."/>
-      <w:lvlJc w:val="left"/>
-      <w:pPr>
-        <w:tabs>
-          <w:tab w:val="num" w:pos="540"/>
-        </w:tabs>
-        <w:ind w:left="540" w:hanging="270"/>
-        <w:spacing w:after="80" w:line="300" w:lineRule="auto"/>
-      </w:pPr>
-    </w:lvl>
-  </w:abstractNum>
-  <w:num w:numId="16">
-    <w:abstractNumId w:val="15"/>
   </w:num>
 </w:numbering>
 </file>

</xml_diff>